<commit_message>
Rewrite Pettis County toolkit with Molina as the subject
The previous pass used an uninsured rate, which was rejected on another
toolkit for the same reason, recycled a checkup figure from an Idaho
toolkit, and answered the reviewer's question about United Way's scope
by cataloging United Way's programs, which made the posts read as
partner promotion.

Each post now carries a different Pettis County health measure that has
nothing to do with coverage, and United Way appears as the host and the
campaign rather than the subject.

Co-Authored-By: Claude Opus 5 <noreply@anthropic.com>
Claude-Session: https://claude.ai/code/session_01HHV2xKdnP4FvnPx6AG9vDv
</commit_message>
<xml_diff>
--- a/output/260928_Pettis_County_United_Way_Toolkit_TRACKED.docx
+++ b/output/260928_Pettis_County_United_Way_Toolkit_TRACKED.docx
@@ -227,7 +227,7 @@
             <w:sz w:val="24"/>
             <w:szCs w:val="24"/>
           </w:rPr>
-          <w:t xml:space="preserve">The Molina Healthcare of Missouri team was at Liberty Park in Sedalia for Day at the Park, helping open United Way of Pettis County’s 2027 campaign.</w:t>
+          <w:t xml:space="preserve">The Molina Healthcare of Missouri team was at Liberty Park in Sedalia for Day at the Park, the event that opens United Way of Pettis County’s 2027 campaign.</w:t>
         </w:r>
       </w:ins>
     </w:p>
@@ -270,7 +270,7 @@
             <w:sz w:val="24"/>
             <w:szCs w:val="24"/>
           </w:rPr>
-          <w:t xml:space="preserve">United Way of Pettis County funds work across education, health, financial stability and basic needs, and operates 211, a free line residents can call any hour to find local help.</w:t>
+          <w:t xml:space="preserve">More than one in three adults in Pettis County have high blood pressure, and roughly one in five of them is not taking medication to control it. A gap like that narrows when someone knows what their plan covers and who to call about it.</w:t>
         </w:r>
       </w:ins>
     </w:p>
@@ -289,19 +289,6 @@
     </w:p>
     <w:p>
       <w:ins w:id="3010" w:author="Claude" w:date="2026-09-28T12:00:00Z">
-        <w:r>
-          <w:rPr>
-            <w:rFonts w:ascii="Calibri" w:cs="Calibri" w:eastAsia="Calibri" w:hAnsi="Calibri"/>
-            <w:color w:val="000000"/>
-            <w:sz w:val="24"/>
-            <w:szCs w:val="24"/>
-          </w:rPr>
-          <w:t xml:space="preserve">About one in nine working-age adults in Pettis County has no health insurance. A day like this one is where some of them find out what they qualify for.</w:t>
-        </w:r>
-      </w:ins>
-    </w:p>
-    <w:p>
-      <w:ins w:id="3011" w:author="Claude" w:date="2026-09-28T12:00:00Z">
         <w:r>
           <w:rPr>
             <w:rFonts w:ascii="Calibri" w:cs="Calibri" w:eastAsia="Calibri" w:hAnsi="Calibri"/>
@@ -349,7 +336,7 @@
       </w:r>
     </w:p>
     <w:p>
-      <w:del w:id="3012" w:author="Claude" w:date="2026-09-28T12:00:00Z">
+      <w:del w:id="3011" w:author="Claude" w:date="2026-09-28T12:00:00Z">
         <w:r>
           <w:rPr>
             <w:rFonts w:ascii="Calibri" w:cs="Calibri" w:eastAsia="Calibri" w:hAnsi="Calibri"/>
@@ -362,20 +349,20 @@
       </w:del>
     </w:p>
     <w:p>
-      <w:ins w:id="3013" w:author="Claude" w:date="2026-09-28T12:00:00Z">
-        <w:r>
-          <w:rPr>
-            <w:rFonts w:ascii="Calibri" w:cs="Calibri" w:eastAsia="Calibri" w:hAnsi="Calibri"/>
-            <w:color w:val="000000"/>
-            <w:sz w:val="24"/>
-            <w:szCs w:val="24"/>
-          </w:rPr>
-          <w:t xml:space="preserve">Our Molina Healthcare of Missouri team spent the day at Liberty Park for United Way of Pettis County’s Day at the Park, the kickoff to their 2027 campaign. The day included food, field day activities and a vehicle display.</w:t>
-        </w:r>
-      </w:ins>
-    </w:p>
-    <w:p>
-      <w:del w:id="3014" w:author="Claude" w:date="2026-09-28T12:00:00Z">
+      <w:ins w:id="3012" w:author="Claude" w:date="2026-09-28T12:00:00Z">
+        <w:r>
+          <w:rPr>
+            <w:rFonts w:ascii="Calibri" w:cs="Calibri" w:eastAsia="Calibri" w:hAnsi="Calibri"/>
+            <w:color w:val="000000"/>
+            <w:sz w:val="24"/>
+            <w:szCs w:val="24"/>
+          </w:rPr>
+          <w:t xml:space="preserve">Our Molina Healthcare of Missouri team spent the day at Liberty Park for United Way of Pettis County’s Day at the Park, the kickoff to their 2027 campaign. Food, field day activities and a vehicle display filled the park.</w:t>
+        </w:r>
+      </w:ins>
+    </w:p>
+    <w:p>
+      <w:del w:id="3013" w:author="Claude" w:date="2026-09-28T12:00:00Z">
         <w:r>
           <w:rPr>
             <w:rFonts w:ascii="Calibri" w:cs="Calibri" w:eastAsia="Calibri" w:hAnsi="Calibri"/>
@@ -388,7 +375,7 @@
       </w:del>
     </w:p>
     <w:p>
-      <w:ins w:id="3015" w:author="Claude" w:date="2026-09-28T12:00:00Z">
+      <w:ins w:id="3014" w:author="Claude" w:date="2026-09-28T12:00:00Z">
         <w:r>
           <w:rPr>
             <w:rFonts w:ascii="Calibri" w:cs="Calibri" w:eastAsia="Calibri" w:hAnsi="Calibri"/>
@@ -405,7 +392,7 @@
       </w:ins>
     </w:p>
     <w:p>
-      <w:del w:id="3016" w:author="Claude" w:date="2026-09-28T12:00:00Z">
+      <w:del w:id="3015" w:author="Claude" w:date="2026-09-28T12:00:00Z">
         <w:r>
           <w:rPr>
             <w:rFonts w:ascii="Calibri" w:cs="Calibri" w:eastAsia="Calibri" w:hAnsi="Calibri"/>
@@ -418,20 +405,20 @@
       </w:del>
     </w:p>
     <w:p>
-      <w:ins w:id="3017" w:author="Claude" w:date="2026-09-28T12:00:00Z">
-        <w:r>
-          <w:rPr>
-            <w:rFonts w:ascii="Calibri" w:cs="Calibri" w:eastAsia="Calibri" w:hAnsi="Calibri"/>
-            <w:color w:val="000000"/>
-            <w:sz w:val="24"/>
-            <w:szCs w:val="24"/>
-          </w:rPr>
-          <w:t xml:space="preserve">More than one in five adults in Pettis County did not see a doctor for a routine checkup last year.</w:t>
-        </w:r>
-      </w:ins>
-    </w:p>
-    <w:p>
-      <w:del w:id="3018" w:author="Claude" w:date="2026-09-28T12:00:00Z">
+      <w:ins w:id="3016" w:author="Claude" w:date="2026-09-28T12:00:00Z">
+        <w:r>
+          <w:rPr>
+            <w:rFonts w:ascii="Calibri" w:cs="Calibri" w:eastAsia="Calibri" w:hAnsi="Calibri"/>
+            <w:color w:val="000000"/>
+            <w:sz w:val="24"/>
+            <w:szCs w:val="24"/>
+          </w:rPr>
+          <w:t xml:space="preserve">About one in eleven adults in Pettis County went without reliable transportation in the past year. That is one reason we bring our team out to events like this one rather than waiting for people to come to us.</w:t>
+        </w:r>
+      </w:ins>
+    </w:p>
+    <w:p>
+      <w:del w:id="3017" w:author="Claude" w:date="2026-09-28T12:00:00Z">
         <w:r>
           <w:rPr>
             <w:rFonts w:ascii="Calibri" w:cs="Calibri" w:eastAsia="Calibri" w:hAnsi="Calibri"/>
@@ -444,20 +431,7 @@
       </w:del>
     </w:p>
     <w:p>
-      <w:ins w:id="3019" w:author="Claude" w:date="2026-09-28T12:00:00Z">
-        <w:r>
-          <w:rPr>
-            <w:rFonts w:ascii="Calibri" w:cs="Calibri" w:eastAsia="Calibri" w:hAnsi="Calibri"/>
-            <w:color w:val="000000"/>
-            <w:sz w:val="24"/>
-            <w:szCs w:val="24"/>
-          </w:rPr>
-          <w:t xml:space="preserve">If you live in Pettis County and need help finding a resource, United Way runs 211. It is free, confidential and staffed 24 hours a day.</w:t>
-        </w:r>
-      </w:ins>
-    </w:p>
-    <w:p>
-      <w:ins w:id="3020" w:author="Claude" w:date="2026-09-28T12:00:00Z">
+      <w:ins w:id="3018" w:author="Claude" w:date="2026-09-28T12:00:00Z">
         <w:r>
           <w:rPr>
             <w:rFonts w:ascii="Calibri" w:cs="Calibri" w:eastAsia="Calibri" w:hAnsi="Calibri"/>
@@ -505,6 +479,32 @@
       </w:r>
     </w:p>
     <w:p>
+      <w:del w:id="3019" w:author="Claude" w:date="2026-09-28T12:00:00Z">
+        <w:r>
+          <w:rPr>
+            <w:rFonts w:ascii="Calibri" w:cs="Calibri" w:eastAsia="Calibri" w:hAnsi="Calibri"/>
+            <w:color w:val="000000"/>
+            <w:sz w:val="24"/>
+            <w:szCs w:val="24"/>
+          </w:rPr>
+          <w:delText xml:space="preserve">Thank you to United Way of Pettis County and Sedalia Parks and Recreation for Day at the Park, and to everyone who stopped by to talk with our Molina Healthcare of Missouri team at Liberty Park.</w:delText>
+        </w:r>
+      </w:del>
+    </w:p>
+    <w:p>
+      <w:ins w:id="3020" w:author="Claude" w:date="2026-09-28T12:00:00Z">
+        <w:r>
+          <w:rPr>
+            <w:rFonts w:ascii="Calibri" w:cs="Calibri" w:eastAsia="Calibri" w:hAnsi="Calibri"/>
+            <w:color w:val="000000"/>
+            <w:sz w:val="24"/>
+            <w:szCs w:val="24"/>
+          </w:rPr>
+          <w:t xml:space="preserve">I spent Day at the Park in Sedalia with our Molina Healthcare of Missouri team, helping open United Way of Pettis County’s 2027 campaign.</w:t>
+        </w:r>
+      </w:ins>
+    </w:p>
+    <w:p>
       <w:del w:id="3021" w:author="Claude" w:date="2026-09-28T12:00:00Z">
         <w:r>
           <w:rPr>
@@ -513,7 +513,7 @@
             <w:sz w:val="24"/>
             <w:szCs w:val="24"/>
           </w:rPr>
-          <w:delText xml:space="preserve">Thank you to United Way of Pettis County and Sedalia Parks and Recreation for Day at the Park, and to everyone who stopped by to talk with our Molina Healthcare of Missouri team at Liberty Park.</w:delText>
+          <w:delText xml:space="preserve">There is a particular kind of conversation that only happens at a folding table in a park. The questions that come up are different from the ones people ask on a phone call. They are more specific, and they are usually the ones that have been sitting unanswered for a while.</w:delText>
         </w:r>
       </w:del>
     </w:p>
@@ -526,38 +526,12 @@
             <w:sz w:val="24"/>
             <w:szCs w:val="24"/>
           </w:rPr>
-          <w:t xml:space="preserve">I spent Day at the Park in Sedalia with our Molina Healthcare of Missouri team, helping open United Way of Pettis County’s 2027 campaign.</w:t>
-        </w:r>
-      </w:ins>
-    </w:p>
-    <w:p>
-      <w:del w:id="3023" w:author="Claude" w:date="2026-09-28T12:00:00Z">
-        <w:r>
-          <w:rPr>
-            <w:rFonts w:ascii="Calibri" w:cs="Calibri" w:eastAsia="Calibri" w:hAnsi="Calibri"/>
-            <w:color w:val="000000"/>
-            <w:sz w:val="24"/>
-            <w:szCs w:val="24"/>
-          </w:rPr>
-          <w:delText xml:space="preserve">There is a particular kind of conversation that only happens at a folding table in a park. The questions that come up are different from the ones people ask on a phone call. They are more specific, and they are usually the ones that have been sitting unanswered for a while.</w:delText>
-        </w:r>
-      </w:del>
-    </w:p>
-    <w:p>
-      <w:ins w:id="3024" w:author="Claude" w:date="2026-09-28T12:00:00Z">
-        <w:r>
-          <w:rPr>
-            <w:rFonts w:ascii="Calibri" w:cs="Calibri" w:eastAsia="Calibri" w:hAnsi="Calibri"/>
-            <w:color w:val="000000"/>
-            <w:sz w:val="24"/>
-            <w:szCs w:val="24"/>
-          </w:rPr>
-          <w:t xml:space="preserve">About one in eleven adults in Pettis County went without reliable transportation last year. People who would need a ride to reach an office stopped at our table on their way past the field day.</w:t>
-        </w:r>
-      </w:ins>
-    </w:p>
-    <w:p>
-      <w:ins w:id="3025" w:author="Claude" w:date="2026-09-28T12:00:00Z">
+          <w:t xml:space="preserve">About one in five adults in Pettis County report a lack of social and emotional support. A number like that moves when the organizations already embedded in a community have what they need to do their work, which is why Molina backs this campaign.</w:t>
+        </w:r>
+      </w:ins>
+    </w:p>
+    <w:p>
+      <w:ins w:id="3023" w:author="Claude" w:date="2026-09-28T12:00:00Z">
         <w:r>
           <w:rPr>
             <w:rFonts w:ascii="Calibri" w:cs="Calibri" w:eastAsia="Calibri" w:hAnsi="Calibri"/>
@@ -569,12 +543,12 @@
             <w:highlight w:val="yellow"/>
             <w:highlightCs w:val="yellow"/>
           </w:rPr>
-          <w:t xml:space="preserve">[INSERT: one real question someone asked that day]</w:t>
-        </w:r>
-      </w:ins>
-    </w:p>
-    <w:p>
-      <w:del w:id="3026" w:author="Claude" w:date="2026-09-28T12:00:00Z">
+          <w:t xml:space="preserve">[INSERT: one specific thing from the day]</w:t>
+        </w:r>
+      </w:ins>
+    </w:p>
+    <w:p>
+      <w:del w:id="3024" w:author="Claude" w:date="2026-09-28T12:00:00Z">
         <w:r>
           <w:rPr>
             <w:rFonts w:ascii="Calibri" w:cs="Calibri" w:eastAsia="Calibri" w:hAnsi="Calibri"/>
@@ -587,20 +561,20 @@
       </w:del>
     </w:p>
     <w:p>
-      <w:ins w:id="3027" w:author="Claude" w:date="2026-09-28T12:00:00Z">
-        <w:r>
-          <w:rPr>
-            <w:rFonts w:ascii="Calibri" w:cs="Calibri" w:eastAsia="Calibri" w:hAnsi="Calibri"/>
-            <w:color w:val="000000"/>
-            <w:sz w:val="24"/>
-            <w:szCs w:val="24"/>
-          </w:rPr>
-          <w:t xml:space="preserve">Everything United Way of Pettis County raises stays in Sedalia and the surrounding county, funding programs in education, health, financial stability and basic needs.</w:t>
-        </w:r>
-      </w:ins>
-    </w:p>
-    <w:p>
-      <w:ins w:id="3028" w:author="Claude" w:date="2026-09-28T12:00:00Z">
+      <w:ins w:id="3025" w:author="Claude" w:date="2026-09-28T12:00:00Z">
+        <w:r>
+          <w:rPr>
+            <w:rFonts w:ascii="Calibri" w:cs="Calibri" w:eastAsia="Calibri" w:hAnsi="Calibri"/>
+            <w:color w:val="000000"/>
+            <w:sz w:val="24"/>
+            <w:szCs w:val="24"/>
+          </w:rPr>
+          <w:t xml:space="preserve">Everything United Way of Pettis County raises stays in Sedalia and the surrounding county.</w:t>
+        </w:r>
+      </w:ins>
+    </w:p>
+    <w:p>
+      <w:ins w:id="3026" w:author="Claude" w:date="2026-09-28T12:00:00Z">
         <w:r>
           <w:rPr>
             <w:rFonts w:ascii="Calibri" w:cs="Calibri" w:eastAsia="Calibri" w:hAnsi="Calibri"/>
@@ -638,41 +612,28 @@
       </w:r>
     </w:p>
     <w:p>
-      <w:ins w:id="3029" w:author="Claude" w:date="2026-09-28T12:00:00Z">
-        <w:r>
-          <w:rPr>
-            <w:rFonts w:ascii="Calibri" w:cs="Calibri" w:eastAsia="Calibri" w:hAnsi="Calibri"/>
-            <w:color w:val="000000"/>
-            <w:sz w:val="24"/>
-            <w:szCs w:val="24"/>
-          </w:rPr>
-          <w:t xml:space="preserve">All three figures are CDC PLACES 2023 county data for Pettis County: https://data.cdc.gov/d/swc5-untb</w:t>
-        </w:r>
-      </w:ins>
-    </w:p>
-    <w:p>
-      <w:ins w:id="3030" w:author="Claude" w:date="2026-09-28T12:00:00Z">
-        <w:r>
-          <w:rPr>
-            <w:rFonts w:ascii="Calibri" w:cs="Calibri" w:eastAsia="Calibri" w:hAnsi="Calibri"/>
-            <w:color w:val="000000"/>
-            <w:sz w:val="24"/>
-            <w:szCs w:val="24"/>
-          </w:rPr>
-          <w:t xml:space="preserve">Uninsured, adults 18 to 64: 10.6%. Routine checkup in the past year: 78.2%, so 21.8% did not. Lack of reliable transportation in the past 12 months: 8.8%.</w:t>
-        </w:r>
-      </w:ins>
-    </w:p>
-    <w:p>
-      <w:ins w:id="3031" w:author="Claude" w:date="2026-09-28T12:00:00Z">
-        <w:r>
-          <w:rPr>
-            <w:rFonts w:ascii="Calibri" w:cs="Calibri" w:eastAsia="Calibri" w:hAnsi="Calibri"/>
-            <w:color w:val="000000"/>
-            <w:sz w:val="24"/>
-            <w:szCs w:val="24"/>
-          </w:rPr>
-          <w:t xml:space="preserve">United Way of Pettis County impact areas and 211: https://www.spcuw.org/</w:t>
+      <w:ins w:id="3027" w:author="Claude" w:date="2026-09-28T12:00:00Z">
+        <w:r>
+          <w:rPr>
+            <w:rFonts w:ascii="Calibri" w:cs="Calibri" w:eastAsia="Calibri" w:hAnsi="Calibri"/>
+            <w:color w:val="000000"/>
+            <w:sz w:val="24"/>
+            <w:szCs w:val="24"/>
+          </w:rPr>
+          <w:t xml:space="preserve">CDC PLACES 2023 county data, Pettis County: https://data.cdc.gov/d/swc5-untb</w:t>
+        </w:r>
+      </w:ins>
+    </w:p>
+    <w:p>
+      <w:ins w:id="3028" w:author="Claude" w:date="2026-09-28T12:00:00Z">
+        <w:r>
+          <w:rPr>
+            <w:rFonts w:ascii="Calibri" w:cs="Calibri" w:eastAsia="Calibri" w:hAnsi="Calibri"/>
+            <w:color w:val="000000"/>
+            <w:sz w:val="24"/>
+            <w:szCs w:val="24"/>
+          </w:rPr>
+          <w:t xml:space="preserve">High blood pressure among adults: 36.3%. Taking medicine to control high blood pressure among adults who have it: 77.6%, so 22.4% are not. Lack of reliable transportation in the past 12 months: 8.8%. Lack of social and emotional support among adults: 20.3%.</w:t>
         </w:r>
       </w:ins>
     </w:p>

</xml_diff>